<commit_message>
docs: add source audio quality and independent dual review gates
</commit_message>
<xml_diff>
--- a/docs/douyin-operations/video-production-operations-review-public.docx
+++ b/docs/douyin-operations/video-production-operations-review-public.docx
@@ -681,7 +681,7 @@
     </w:p>
     <w:p>
       <w:r>
-        <w:t>技术解码、音源链、字幕、画面、事实、素材权利、主观听感、实体手机播放和平台转码分别写通过／失败／未检查。波形相关、ASR相符和全片解码通过都不能替代实际听审。</w:t>
+        <w:t>技术筛查、音源链、字幕语义完整、画面、事实、素材权利、完整实际听审、实体手机播放和平台转码分别写通过／失败／未检查。波形相关、ASR相符和全片解码通过都不能替代实际听审；没有实际听过，就填写“未检查”。</w:t>
       </w:r>
     </w:p>
     <w:p>
@@ -708,6 +708,61 @@
           <w:t>https://ffmpeg.org/ffmpeg-formats.html#concat</w:t>
         </w:r>
       </w:hyperlink>
+    </w:p>
+    <w:p>
+      <w:r>
+        <w:br w:type="page"/>
+      </w:r>
+    </w:p>
+    <w:p>
+      <w:pPr>
+        <w:pStyle w:val="Heading2"/>
+      </w:pPr>
+      <w:r>
+        <w:t>增益前先拦截坏源</w:t>
+      </w:r>
+    </w:p>
+    <w:p>
+      <w:r>
+        <w:t>脱敏复盘：一段最早留存的口播源文件已包含约5秒近静止谐波嗡声，后续却被当作弱句提高音量。原源按记录处理后与母带逐样本一致，成片也可完整解码，但这些检查没有拦住源内容缺陷。已证实的是坏声在留存源中已存在；缺少更早生成文件和日志时，不能断言是模型生成或哪次转码首先引入。</w:t>
+      </w:r>
+    </w:p>
+    <w:p>
+      <w:pPr>
+        <w:ind w:left="173" w:hanging="173"/>
+      </w:pPr>
+      <w:r>
+        <w:t>• 每条最早原源从头到尾核验，再进入增益和混音。遇到音量异常低、持续稳定音调或字幕有句子而音频缺少语音变化时，暂停“弱句补响”，对照原源、母带、成片的同一时间窗并匹配回放响度。</w:t>
+      </w:r>
+    </w:p>
+    <w:p>
+      <w:pPr>
+        <w:ind w:left="173" w:hanging="173"/>
+      </w:pPr>
+      <w:r>
+        <w:t>• 把持续窄带、谐波平台、异常静音、突变和重复片段列为技术候选，再逐项核听与核对句义。150／200Hz固定特征只针对已知故障；未命中不能写成“无噪音”，也不能保证发现其他频率或其他类型的坏声。记录检测范围、阈值、时间窗和漏检边界。</w:t>
+      </w:r>
+    </w:p>
+    <w:p>
+      <w:pPr>
+        <w:ind w:left="173" w:hanging="173"/>
+      </w:pPr>
+      <w:r>
+        <w:t>• 增益前预测峰值并记录处理量。大幅增益或动态压限应专门复核，不能靠自动limiter追平均响度。无满幅削波、频谱正常或ASR文字相符，均不能单独证明听感合格。</w:t>
+      </w:r>
+    </w:p>
+    <w:p>
+      <w:pPr>
+        <w:ind w:left="173" w:hanging="173"/>
+      </w:pPr>
+      <w:r>
+        <w:t>• 对照实际口播逐句核字幕语义，尤其检查嗡声、静音、拼接和尾部是否替代了应有的话。保留稿只能说明计划内容，不能证明声音已经说出；完整听审须从最终文件开头到结尾实际回放，包含每个源段、接缝和收尾。</w:t>
+      </w:r>
+    </w:p>
+    <w:p>
+      <w:r>
+        <w:t>发现异常先保留证据并阻断受影响交付，不盲目批量降噪、删除或重生成。已发布或已排期作品先做只读核查；替换、重传、下架或更改排期须取得对应授权。修复产生新文件后，原审核结论不能自动继承。</w:t>
+      </w:r>
     </w:p>
     <w:p>
       <w:r>
@@ -840,7 +895,7 @@
     </w:p>
     <w:p>
       <w:r>
-        <w:t>每片明确制作负责人、复核人和发布操作人；可以兼任，但每项都留下实际检查记录。交付和公开发布按该片已经获得的批准执行。</w:t>
+        <w:t>每片明确制作负责人、两位指定审核者和发布操作人。两位审核者分别承担制作审核与交付审核，必须各自检查同一最终SHA256并独立留下结论；额外技术协作者的报告不能冒充任一指定审核者的通过。交付和公开发布仍按该片已经获得的批准执行。</w:t>
       </w:r>
     </w:p>
     <w:p>
@@ -864,7 +919,7 @@
         <w:ind w:left="173" w:hanging="173"/>
       </w:pPr>
       <w:r>
-        <w:t>• 渲染前：原音源可追溯；实际口播与字幕匹配；字幕、credit和资料标签在实帧中可读。</w:t>
+        <w:t>• 渲染前：原音源可追溯且内容质量已核；实际口播与字幕语义完整匹配；字幕、credit和资料标签在实帧中可读。</w:t>
       </w:r>
     </w:p>
     <w:p>
@@ -872,7 +927,7 @@
         <w:ind w:left="173" w:hanging="173"/>
       </w:pPr>
       <w:r>
-        <w:t>• 交付前：最终文件指纹确定；全片解码和整轨尾部检查完成；听审、手机检查等未做项如实标明。不把有限技术通过写成全部通过。</w:t>
+        <w:t>• 交付前：锁定最终SHA256；全片解码、整轨尾部、字幕语义完整及完整实际听审均完成，两位指定审核者各自通过后才交付。任何一方缺席、未实际听审、有失败项或审核指纹不同，都保持待审；不以技术通过补写听审通过。</w:t>
       </w:r>
     </w:p>
     <w:p>
@@ -1321,18 +1376,27 @@
     </w:p>
     <w:p>
       <w:r>
+        <w:t>每份审核记录应列明审核者、日期、最终SHA256、实际检查范围、技术筛查结果、字幕语义完整性、完整听审结果及遗留问题。手机和平台转码检查另列状态。重导出或修复后重新计算SHA256，由两位审核者重审新最终文件；制作自检和独立技术报告不能替代双审核。</w:t>
+      </w:r>
+    </w:p>
+    <w:p>
+      <w:r>
         <w:br w:type="page"/>
       </w:r>
     </w:p>
     <w:p>
       <w:pPr>
         <w:pStyle w:val="Heading1"/>
+        <w:spacing w:after="60" w:before="120"/>
       </w:pPr>
       <w:r>
         <w:t>06 单片复盘空白模板</w:t>
       </w:r>
     </w:p>
     <w:p>
+      <w:pPr>
+        <w:spacing w:after="60"/>
+      </w:pPr>
       <w:r>
         <w:t>复制本页，在非公开记录中填写。先填证据，再写解释；空项写“未采”或“未检查”。公开分享前去除账号、个人信息、私有文件定位和未获准公开的业务数据。</w:t>
       </w:r>
@@ -1340,32 +1404,48 @@
     <w:p>
       <w:pPr>
         <w:pStyle w:val="Heading2"/>
+        <w:spacing w:after="60" w:before="120"/>
       </w:pPr>
       <w:r>
         <w:t>基本信息与本次改动</w:t>
       </w:r>
     </w:p>
     <w:p>
+      <w:pPr>
+        <w:spacing w:after="60"/>
+      </w:pPr>
       <w:r>
         <w:t>作品代号 __________________  版本 __________________</w:t>
       </w:r>
     </w:p>
     <w:p>
+      <w:pPr>
+        <w:spacing w:after="60"/>
+      </w:pPr>
       <w:r>
         <w:t>片长 __________  平台 __________  实际公开时间与时区 __________________</w:t>
       </w:r>
     </w:p>
     <w:p>
+      <w:pPr>
+        <w:spacing w:after="60"/>
+      </w:pPr>
       <w:r>
         <w:t>公开时间证据 __________________  采集时刻 __________________</w:t>
       </w:r>
     </w:p>
     <w:p>
+      <w:pPr>
+        <w:spacing w:after="60"/>
+      </w:pPr>
       <w:r>
         <w:t>这次主要改动 __________________________________________________</w:t>
       </w:r>
     </w:p>
     <w:p>
+      <w:pPr>
+        <w:spacing w:after="60"/>
+      </w:pPr>
       <w:r>
         <w:t>预期改变的指标 __________________  预定复盘时点 __________________</w:t>
       </w:r>
@@ -1373,6 +1453,7 @@
     <w:p>
       <w:pPr>
         <w:pStyle w:val="Heading2"/>
+        <w:spacing w:after="60" w:before="120"/>
       </w:pPr>
       <w:r>
         <w:t>数据记录</w:t>
@@ -2023,6 +2104,9 @@
       </w:tr>
     </w:tbl>
     <w:p>
+      <w:pPr>
+        <w:spacing w:after="60"/>
+      </w:pPr>
       <w:r>
         <w:t>自然日数据另记日期与口径，不混进发布龄累计表。字段定义、导出标签冲突或延迟：</w:t>
         <w:br/>
@@ -2032,22 +2116,32 @@
     <w:p>
       <w:pPr>
         <w:pStyle w:val="Heading2"/>
+        <w:spacing w:after="60" w:before="120"/>
       </w:pPr>
       <w:r>
         <w:t>已证事实与解释分开写</w:t>
       </w:r>
     </w:p>
     <w:p>
+      <w:pPr>
+        <w:spacing w:after="60"/>
+      </w:pPr>
       <w:r>
         <w:t>已证事实及来源 __________________________________________________</w:t>
       </w:r>
     </w:p>
     <w:p>
+      <w:pPr>
+        <w:spacing w:after="60"/>
+      </w:pPr>
       <w:r>
         <w:t>可能解释与其他因素 ______________________________________________</w:t>
       </w:r>
     </w:p>
     <w:p>
+      <w:pPr>
+        <w:spacing w:after="60"/>
+      </w:pPr>
       <w:r>
         <w:t>缺失证据／不能下的结论 __________________________________________</w:t>
       </w:r>
@@ -2055,21 +2149,42 @@
     <w:p>
       <w:pPr>
         <w:pStyle w:val="Heading2"/>
+        <w:spacing w:after="60" w:before="120"/>
       </w:pPr>
       <w:r>
         <w:t>检查结果与发布回读</w:t>
       </w:r>
     </w:p>
     <w:p>
+      <w:pPr>
+        <w:spacing w:after="60"/>
+      </w:pPr>
       <w:r>
         <w:t>各填通过／失败／未检查：</w:t>
         <w:br/>
-        <w:t>原音源链 ______  解码与尾部 ______  字幕画面 ______  事实 ______</w:t>
+        <w:t>原源内容质量 ______  原音源链 ______  技术筛查及尾部 ______</w:t>
         <w:br/>
-        <w:t>素材权利 ______  主观听感 ______  手机播放 ______  平台转码 ______</w:t>
+        <w:t>字幕语义完整 ______  字幕画面 ______  事实与素材权利 ______</w:t>
+        <w:br/>
+        <w:t>完整实际听审 ______  手机播放 ______  平台转码 ______</w:t>
       </w:r>
     </w:p>
     <w:p>
+      <w:pPr>
+        <w:spacing w:after="60"/>
+      </w:pPr>
+      <w:r>
+        <w:t>最终SHA256 ____________________________________________________</w:t>
+        <w:br/>
+        <w:t>制作审核者与日期 __________  独立结果及记录位置 __________________</w:t>
+        <w:br/>
+        <w:t>交付审核者与日期 __________  独立结果及记录位置 __________________</w:t>
+      </w:r>
+    </w:p>
+    <w:p>
+      <w:pPr>
+        <w:spacing w:after="60"/>
+      </w:pPr>
       <w:r>
         <w:t>最终版本确认 ______  单次提交回读 ______  到时公开回读 ______</w:t>
         <w:br/>
@@ -2079,27 +2194,40 @@
     <w:p>
       <w:pPr>
         <w:pStyle w:val="Heading2"/>
+        <w:spacing w:after="60" w:before="120"/>
       </w:pPr>
       <w:r>
         <w:t>下次怎样改</w:t>
       </w:r>
     </w:p>
     <w:p>
+      <w:pPr>
+        <w:spacing w:after="60"/>
+      </w:pPr>
       <w:r>
         <w:t>保留／撤回／继续验证的改法 ______________________________________</w:t>
       </w:r>
     </w:p>
     <w:p>
+      <w:pPr>
+        <w:spacing w:after="60"/>
+      </w:pPr>
       <w:r>
         <w:t>下一步 __________________  负责人 __________  复查日期 __________</w:t>
       </w:r>
     </w:p>
     <w:p>
+      <w:pPr>
+        <w:spacing w:after="60"/>
+      </w:pPr>
       <w:r>
         <w:t>复核意见 ________________________________________________________</w:t>
       </w:r>
     </w:p>
     <w:p>
+      <w:pPr>
+        <w:spacing w:after="60"/>
+      </w:pPr>
       <w:r>
         <w:t>记录原则：不补造缺失采样，不把推测写成因果，不跨版本继承通过，不把点击、缩略图或草稿当作发布和接收完成。</w:t>
       </w:r>

</xml_diff>